<commit_message>
Band 3: Kapitelkoepfe Muster A + Band-4-Leseprobe + QR-Block (ASIN offen)
- Kapitelkoepfe auf Muster A (Sink 56pt, 6x9): gesperrte graue Versalien
  KAPITEL X / EPILOG, Titel 17pt. Heading-Ebenen erhalten.
- add_band4_teaser liest jetzt den ECHTEN Band-4-Kapitel-1-Text direkt aus der
  Datei (bis zum Cliffhanger "Diesmal widersprach ihm keiner.") statt des alten
  erfundenen Teasers. Bleibt automatisch synchron. " -- " -> " — ".
- QR-Block auf der "Eine kleine Bitte"-Seite eingebaut (mit Zeilenabstand-Fix),
  skippt sauber, solange qr_rezension_band3.png fehlt.

OFFEN: Band-3-Taschenbuch-ASIN -> dann QR erzeugen (build_qr_rezension.py) und
Manuskript neu bauen.

Co-Authored-By: Claude Opus 4.8 <noreply@anthropic.com>
</commit_message>
<xml_diff>
--- a/Band_3/Linear/Manuskript.docx
+++ b/Band_3/Linear/Manuskript.docx
@@ -604,7 +604,7 @@
     </w:p>
     <w:p>
       <w:pPr>
-        <w:spacing w:after="200"/>
+        <w:spacing w:before="0" w:after="1120"/>
       </w:pPr>
     </w:p>
     <w:p>
@@ -612,18 +612,21 @@
         <w:pStyle w:val="Heading2"/>
       </w:pPr>
       <w:r>
-        <w:t>Kapitel 1</w:t>
-      </w:r>
-    </w:p>
-    <w:p>
-      <w:bookmarkStart w:id="58894" w:name="kapitel_1"/>
+        <w:rPr>
+          <w:spacing w:val="52"/>
+        </w:rPr>
+        <w:t>KAPITEL 1</w:t>
+      </w:r>
+    </w:p>
+    <w:p>
+      <w:bookmarkStart w:id="93156" w:name="kapitel_1"/>
       <w:pPr>
         <w:pStyle w:val="Heading1"/>
       </w:pPr>
       <w:r>
         <w:t>Das zweite X</w:t>
       </w:r>
-      <w:bookmarkEnd w:id="58894"/>
+      <w:bookmarkEnd w:id="93156"/>
     </w:p>
     <w:p>
       <w:pPr>
@@ -1926,7 +1929,7 @@
     </w:p>
     <w:p>
       <w:pPr>
-        <w:spacing w:after="200"/>
+        <w:spacing w:before="0" w:after="1120"/>
       </w:pPr>
     </w:p>
     <w:p>
@@ -1934,18 +1937,21 @@
         <w:pStyle w:val="Heading2"/>
       </w:pPr>
       <w:r>
-        <w:t>Kapitel 2</w:t>
-      </w:r>
-    </w:p>
-    <w:p>
-      <w:bookmarkStart w:id="76175" w:name="kapitel_2"/>
+        <w:rPr>
+          <w:spacing w:val="52"/>
+        </w:rPr>
+        <w:t>KAPITEL 2</w:t>
+      </w:r>
+    </w:p>
+    <w:p>
+      <w:bookmarkStart w:id="65955" w:name="kapitel_2"/>
       <w:pPr>
         <w:pStyle w:val="Heading1"/>
       </w:pPr>
       <w:r>
         <w:t>Der Mann mit der Axt</w:t>
       </w:r>
-      <w:bookmarkEnd w:id="76175"/>
+      <w:bookmarkEnd w:id="65955"/>
     </w:p>
     <w:p>
       <w:pPr>
@@ -3168,7 +3174,7 @@
     </w:p>
     <w:p>
       <w:pPr>
-        <w:spacing w:after="200"/>
+        <w:spacing w:before="0" w:after="1120"/>
       </w:pPr>
     </w:p>
     <w:p>
@@ -3176,18 +3182,21 @@
         <w:pStyle w:val="Heading2"/>
       </w:pPr>
       <w:r>
-        <w:t>Kapitel 3</w:t>
-      </w:r>
-    </w:p>
-    <w:p>
-      <w:bookmarkStart w:id="46605" w:name="kapitel_3"/>
+        <w:rPr>
+          <w:spacing w:val="52"/>
+        </w:rPr>
+        <w:t>KAPITEL 3</w:t>
+      </w:r>
+    </w:p>
+    <w:p>
+      <w:bookmarkStart w:id="18443" w:name="kapitel_3"/>
       <w:pPr>
         <w:pStyle w:val="Heading1"/>
       </w:pPr>
       <w:r>
         <w:t>Risse im Pflaster</w:t>
       </w:r>
-      <w:bookmarkEnd w:id="46605"/>
+      <w:bookmarkEnd w:id="18443"/>
     </w:p>
     <w:p>
       <w:pPr>
@@ -4668,7 +4677,7 @@
     </w:p>
     <w:p>
       <w:pPr>
-        <w:spacing w:after="200"/>
+        <w:spacing w:before="0" w:after="1120"/>
       </w:pPr>
     </w:p>
     <w:p>
@@ -4676,18 +4685,21 @@
         <w:pStyle w:val="Heading2"/>
       </w:pPr>
       <w:r>
-        <w:t>Kapitel 4</w:t>
-      </w:r>
-    </w:p>
-    <w:p>
-      <w:bookmarkStart w:id="15632" w:name="kapitel_4"/>
+        <w:rPr>
+          <w:spacing w:val="52"/>
+        </w:rPr>
+        <w:t>KAPITEL 4</w:t>
+      </w:r>
+    </w:p>
+    <w:p>
+      <w:bookmarkStart w:id="8342" w:name="kapitel_4"/>
       <w:pPr>
         <w:pStyle w:val="Heading1"/>
       </w:pPr>
       <w:r>
         <w:t>Der Brief von Winter</w:t>
       </w:r>
-      <w:bookmarkEnd w:id="15632"/>
+      <w:bookmarkEnd w:id="8342"/>
     </w:p>
     <w:p>
       <w:pPr>
@@ -6108,7 +6120,7 @@
     </w:p>
     <w:p>
       <w:pPr>
-        <w:spacing w:after="200"/>
+        <w:spacing w:before="0" w:after="1120"/>
       </w:pPr>
     </w:p>
     <w:p>
@@ -6116,18 +6128,21 @@
         <w:pStyle w:val="Heading2"/>
       </w:pPr>
       <w:r>
-        <w:t>Kapitel 5</w:t>
-      </w:r>
-    </w:p>
-    <w:p>
-      <w:bookmarkStart w:id="39690" w:name="kapitel_5"/>
+        <w:rPr>
+          <w:spacing w:val="52"/>
+        </w:rPr>
+        <w:t>KAPITEL 5</w:t>
+      </w:r>
+    </w:p>
+    <w:p>
+      <w:bookmarkStart w:id="47519" w:name="kapitel_5"/>
       <w:pPr>
         <w:pStyle w:val="Heading1"/>
       </w:pPr>
       <w:r>
         <w:t>Die verschwundene Linie</w:t>
       </w:r>
-      <w:bookmarkEnd w:id="39690"/>
+      <w:bookmarkEnd w:id="47519"/>
     </w:p>
     <w:p>
       <w:pPr>
@@ -7211,7 +7226,7 @@
     </w:p>
     <w:p>
       <w:pPr>
-        <w:spacing w:after="200"/>
+        <w:spacing w:before="0" w:after="1120"/>
       </w:pPr>
     </w:p>
     <w:p>
@@ -7219,18 +7234,21 @@
         <w:pStyle w:val="Heading2"/>
       </w:pPr>
       <w:r>
-        <w:t>Kapitel 6</w:t>
-      </w:r>
-    </w:p>
-    <w:p>
-      <w:bookmarkStart w:id="31490" w:name="kapitel_6"/>
+        <w:rPr>
+          <w:spacing w:val="52"/>
+        </w:rPr>
+        <w:t>KAPITEL 6</w:t>
+      </w:r>
+    </w:p>
+    <w:p>
+      <w:bookmarkStart w:id="71177" w:name="kapitel_6"/>
       <w:pPr>
         <w:pStyle w:val="Heading1"/>
       </w:pPr>
       <w:r>
         <w:t>Der Förster</w:t>
       </w:r>
-      <w:bookmarkEnd w:id="31490"/>
+      <w:bookmarkEnd w:id="71177"/>
     </w:p>
     <w:p>
       <w:pPr>
@@ -8527,7 +8545,7 @@
     </w:p>
     <w:p>
       <w:pPr>
-        <w:spacing w:after="200"/>
+        <w:spacing w:before="0" w:after="1120"/>
       </w:pPr>
     </w:p>
     <w:p>
@@ -8535,18 +8553,21 @@
         <w:pStyle w:val="Heading2"/>
       </w:pPr>
       <w:r>
-        <w:t>Kapitel 7</w:t>
-      </w:r>
-    </w:p>
-    <w:p>
-      <w:bookmarkStart w:id="85151" w:name="kapitel_7"/>
+        <w:rPr>
+          <w:spacing w:val="52"/>
+        </w:rPr>
+        <w:t>KAPITEL 7</w:t>
+      </w:r>
+    </w:p>
+    <w:p>
+      <w:bookmarkStart w:id="71661" w:name="kapitel_7"/>
       <w:pPr>
         <w:pStyle w:val="Heading1"/>
       </w:pPr>
       <w:r>
         <w:t>Hohler Boden</w:t>
       </w:r>
-      <w:bookmarkEnd w:id="85151"/>
+      <w:bookmarkEnd w:id="71661"/>
     </w:p>
     <w:p>
       <w:pPr>
@@ -9760,7 +9781,7 @@
     </w:p>
     <w:p>
       <w:pPr>
-        <w:spacing w:after="200"/>
+        <w:spacing w:before="0" w:after="1120"/>
       </w:pPr>
     </w:p>
     <w:p>
@@ -9768,18 +9789,21 @@
         <w:pStyle w:val="Heading2"/>
       </w:pPr>
       <w:r>
-        <w:t>Kapitel 8</w:t>
-      </w:r>
-    </w:p>
-    <w:p>
-      <w:bookmarkStart w:id="87740" w:name="kapitel_8"/>
+        <w:rPr>
+          <w:spacing w:val="52"/>
+        </w:rPr>
+        <w:t>KAPITEL 8</w:t>
+      </w:r>
+    </w:p>
+    <w:p>
+      <w:bookmarkStart w:id="56284" w:name="kapitel_8"/>
       <w:pPr>
         <w:pStyle w:val="Heading1"/>
       </w:pPr>
       <w:r>
         <w:t>Das alte Wehr</w:t>
       </w:r>
-      <w:bookmarkEnd w:id="87740"/>
+      <w:bookmarkEnd w:id="56284"/>
     </w:p>
     <w:p>
       <w:pPr>
@@ -10945,7 +10969,7 @@
     </w:p>
     <w:p>
       <w:pPr>
-        <w:spacing w:after="200"/>
+        <w:spacing w:before="0" w:after="1120"/>
       </w:pPr>
     </w:p>
     <w:p>
@@ -10953,18 +10977,21 @@
         <w:pStyle w:val="Heading2"/>
       </w:pPr>
       <w:r>
-        <w:t>Kapitel 9</w:t>
-      </w:r>
-    </w:p>
-    <w:p>
-      <w:bookmarkStart w:id="41547" w:name="kapitel_9"/>
+        <w:rPr>
+          <w:spacing w:val="52"/>
+        </w:rPr>
+        <w:t>KAPITEL 9</w:t>
+      </w:r>
+    </w:p>
+    <w:p>
+      <w:bookmarkStart w:id="9094" w:name="kapitel_9"/>
       <w:pPr>
         <w:pStyle w:val="Heading1"/>
       </w:pPr>
       <w:r>
         <w:t>Der Weg zurück</w:t>
       </w:r>
-      <w:bookmarkEnd w:id="41547"/>
+      <w:bookmarkEnd w:id="9094"/>
     </w:p>
     <w:p>
       <w:pPr>
@@ -12226,7 +12253,7 @@
     </w:p>
     <w:p>
       <w:pPr>
-        <w:spacing w:after="200"/>
+        <w:spacing w:before="0" w:after="1120"/>
       </w:pPr>
     </w:p>
     <w:p>
@@ -12234,18 +12261,21 @@
         <w:pStyle w:val="Heading2"/>
       </w:pPr>
       <w:r>
-        <w:t>Kapitel 10</w:t>
-      </w:r>
-    </w:p>
-    <w:p>
-      <w:bookmarkStart w:id="69115" w:name="kapitel_10"/>
+        <w:rPr>
+          <w:spacing w:val="52"/>
+        </w:rPr>
+        <w:t>KAPITEL 10</w:t>
+      </w:r>
+    </w:p>
+    <w:p>
+      <w:bookmarkStart w:id="40840" w:name="kapitel_10"/>
       <w:pPr>
         <w:pStyle w:val="Heading1"/>
       </w:pPr>
       <w:r>
         <w:t>Zurück im Dorf</w:t>
       </w:r>
-      <w:bookmarkEnd w:id="69115"/>
+      <w:bookmarkEnd w:id="40840"/>
     </w:p>
     <w:p>
       <w:pPr>
@@ -13398,7 +13428,7 @@
     </w:p>
     <w:p>
       <w:pPr>
-        <w:spacing w:after="200"/>
+        <w:spacing w:before="0" w:after="1120"/>
       </w:pPr>
     </w:p>
     <w:p>
@@ -13406,18 +13436,21 @@
         <w:pStyle w:val="Heading2"/>
       </w:pPr>
       <w:r>
-        <w:t>Kapitel 11</w:t>
-      </w:r>
-    </w:p>
-    <w:p>
-      <w:bookmarkStart w:id="57241" w:name="kapitel_11"/>
+        <w:rPr>
+          <w:spacing w:val="52"/>
+        </w:rPr>
+        <w:t>KAPITEL 11</w:t>
+      </w:r>
+    </w:p>
+    <w:p>
+      <w:bookmarkStart w:id="66752" w:name="kapitel_11"/>
       <w:pPr>
         <w:pStyle w:val="Heading1"/>
       </w:pPr>
       <w:r>
         <w:t>Der erste Versuch</w:t>
       </w:r>
-      <w:bookmarkEnd w:id="57241"/>
+      <w:bookmarkEnd w:id="66752"/>
     </w:p>
     <w:p>
       <w:pPr>
@@ -14498,7 +14531,7 @@
     </w:p>
     <w:p>
       <w:pPr>
-        <w:spacing w:after="200"/>
+        <w:spacing w:before="0" w:after="1120"/>
       </w:pPr>
     </w:p>
     <w:p>
@@ -14506,18 +14539,21 @@
         <w:pStyle w:val="Heading2"/>
       </w:pPr>
       <w:r>
-        <w:t>Kapitel 12</w:t>
-      </w:r>
-    </w:p>
-    <w:p>
-      <w:bookmarkStart w:id="11370" w:name="kapitel_12"/>
+        <w:rPr>
+          <w:spacing w:val="52"/>
+        </w:rPr>
+        <w:t>KAPITEL 12</w:t>
+      </w:r>
+    </w:p>
+    <w:p>
+      <w:bookmarkStart w:id="45279" w:name="kapitel_12"/>
       <w:pPr>
         <w:pStyle w:val="Heading1"/>
       </w:pPr>
       <w:r>
         <w:t>Jetzt regnet es</w:t>
       </w:r>
-      <w:bookmarkEnd w:id="11370"/>
+      <w:bookmarkEnd w:id="45279"/>
     </w:p>
     <w:p>
       <w:pPr>
@@ -15455,7 +15491,7 @@
     </w:p>
     <w:p>
       <w:pPr>
-        <w:spacing w:after="200"/>
+        <w:spacing w:before="0" w:after="1120"/>
       </w:pPr>
     </w:p>
     <w:p>
@@ -15463,18 +15499,21 @@
         <w:pStyle w:val="Heading2"/>
       </w:pPr>
       <w:r>
-        <w:t>Kapitel 13</w:t>
-      </w:r>
-    </w:p>
-    <w:p>
-      <w:bookmarkStart w:id="94280" w:name="kapitel_13"/>
+        <w:rPr>
+          <w:spacing w:val="52"/>
+        </w:rPr>
+        <w:t>KAPITEL 13</w:t>
+      </w:r>
+    </w:p>
+    <w:p>
+      <w:bookmarkStart w:id="16512" w:name="kapitel_13"/>
       <w:pPr>
         <w:pStyle w:val="Heading1"/>
       </w:pPr>
       <w:r>
         <w:t>Bens Idee am Wehr</w:t>
       </w:r>
-      <w:bookmarkEnd w:id="94280"/>
+      <w:bookmarkEnd w:id="16512"/>
     </w:p>
     <w:p>
       <w:pPr>
@@ -16484,7 +16523,7 @@
     </w:p>
     <w:p>
       <w:pPr>
-        <w:spacing w:after="200"/>
+        <w:spacing w:before="0" w:after="1120"/>
       </w:pPr>
     </w:p>
     <w:p>
@@ -16492,18 +16531,21 @@
         <w:pStyle w:val="Heading2"/>
       </w:pPr>
       <w:r>
-        <w:t>Kapitel 14</w:t>
-      </w:r>
-    </w:p>
-    <w:p>
-      <w:bookmarkStart w:id="13411" w:name="kapitel_14"/>
+        <w:rPr>
+          <w:spacing w:val="52"/>
+        </w:rPr>
+        <w:t>KAPITEL 14</w:t>
+      </w:r>
+    </w:p>
+    <w:p>
+      <w:bookmarkStart w:id="3683" w:name="kapitel_14"/>
       <w:pPr>
         <w:pStyle w:val="Heading1"/>
       </w:pPr>
       <w:r>
         <w:t>Vier Hände</w:t>
       </w:r>
-      <w:bookmarkEnd w:id="13411"/>
+      <w:bookmarkEnd w:id="3683"/>
     </w:p>
     <w:p>
       <w:pPr>
@@ -17609,7 +17651,7 @@
     </w:p>
     <w:p>
       <w:pPr>
-        <w:spacing w:after="200"/>
+        <w:spacing w:before="0" w:after="1120"/>
       </w:pPr>
     </w:p>
     <w:p>
@@ -17617,18 +17659,21 @@
         <w:pStyle w:val="Heading2"/>
       </w:pPr>
       <w:r>
-        <w:t>Kapitel 15</w:t>
-      </w:r>
-    </w:p>
-    <w:p>
-      <w:bookmarkStart w:id="830" w:name="kapitel_15"/>
+        <w:rPr>
+          <w:spacing w:val="52"/>
+        </w:rPr>
+        <w:t>KAPITEL 15</w:t>
+      </w:r>
+    </w:p>
+    <w:p>
+      <w:bookmarkStart w:id="92934" w:name="kapitel_15"/>
       <w:pPr>
         <w:pStyle w:val="Heading1"/>
       </w:pPr>
       <w:r>
         <w:t>Heinrich Winter</w:t>
       </w:r>
-      <w:bookmarkEnd w:id="830"/>
+      <w:bookmarkEnd w:id="92934"/>
     </w:p>
     <w:p>
       <w:pPr>
@@ -18832,7 +18877,7 @@
     </w:p>
     <w:p>
       <w:pPr>
-        <w:spacing w:after="200"/>
+        <w:spacing w:before="0" w:after="1120"/>
       </w:pPr>
     </w:p>
     <w:p>
@@ -18840,18 +18885,21 @@
         <w:pStyle w:val="Heading2"/>
       </w:pPr>
       <w:r>
-        <w:t>Kapitel 16</w:t>
-      </w:r>
-    </w:p>
-    <w:p>
-      <w:bookmarkStart w:id="65644" w:name="kapitel_16"/>
+        <w:rPr>
+          <w:spacing w:val="52"/>
+        </w:rPr>
+        <w:t>KAPITEL 16</w:t>
+      </w:r>
+    </w:p>
+    <w:p>
+      <w:bookmarkStart w:id="26419" w:name="kapitel_16"/>
       <w:pPr>
         <w:pStyle w:val="Heading1"/>
       </w:pPr>
       <w:r>
         <w:t>Das letzte Zittern</w:t>
       </w:r>
-      <w:bookmarkEnd w:id="65644"/>
+      <w:bookmarkEnd w:id="26419"/>
     </w:p>
     <w:p>
       <w:pPr>
@@ -19993,7 +20041,7 @@
     </w:p>
     <w:p>
       <w:pPr>
-        <w:spacing w:after="200"/>
+        <w:spacing w:before="0" w:after="1120"/>
       </w:pPr>
     </w:p>
     <w:p>
@@ -20001,18 +20049,21 @@
         <w:pStyle w:val="Heading2"/>
       </w:pPr>
       <w:r>
-        <w:t>Kapitel 17</w:t>
-      </w:r>
-    </w:p>
-    <w:p>
-      <w:bookmarkStart w:id="66341" w:name="kapitel_17"/>
+        <w:rPr>
+          <w:spacing w:val="52"/>
+        </w:rPr>
+        <w:t>KAPITEL 17</w:t>
+      </w:r>
+    </w:p>
+    <w:p>
+      <w:bookmarkStart w:id="60638" w:name="kapitel_17"/>
       <w:pPr>
         <w:pStyle w:val="Heading1"/>
       </w:pPr>
       <w:r>
         <w:t>Das Dorf atmet auf</w:t>
       </w:r>
-      <w:bookmarkEnd w:id="66341"/>
+      <w:bookmarkEnd w:id="60638"/>
     </w:p>
     <w:p>
       <w:pPr>
@@ -21179,7 +21230,7 @@
     </w:p>
     <w:p>
       <w:pPr>
-        <w:spacing w:after="200"/>
+        <w:spacing w:before="0" w:after="1120"/>
       </w:pPr>
     </w:p>
     <w:p>
@@ -21187,18 +21238,21 @@
         <w:pStyle w:val="Heading2"/>
       </w:pPr>
       <w:r>
-        <w:t>Kapitel 18</w:t>
-      </w:r>
-    </w:p>
-    <w:p>
-      <w:bookmarkStart w:id="57566" w:name="kapitel_18"/>
+        <w:rPr>
+          <w:spacing w:val="52"/>
+        </w:rPr>
+        <w:t>KAPITEL 18</w:t>
+      </w:r>
+    </w:p>
+    <w:p>
+      <w:bookmarkStart w:id="55211" w:name="kapitel_18"/>
       <w:pPr>
         <w:pStyle w:val="Heading1"/>
       </w:pPr>
       <w:r>
         <w:t>Der Förster und der Wald</w:t>
       </w:r>
-      <w:bookmarkEnd w:id="57566"/>
+      <w:bookmarkEnd w:id="55211"/>
     </w:p>
     <w:p>
       <w:pPr>
@@ -22292,7 +22346,7 @@
     </w:p>
     <w:p>
       <w:pPr>
-        <w:spacing w:after="200"/>
+        <w:spacing w:before="0" w:after="1120"/>
       </w:pPr>
     </w:p>
     <w:p>
@@ -22300,18 +22354,21 @@
         <w:pStyle w:val="Heading2"/>
       </w:pPr>
       <w:r>
-        <w:t>Epilog</w:t>
-      </w:r>
-    </w:p>
-    <w:p>
-      <w:bookmarkStart w:id="46989" w:name="kapitel_19"/>
+        <w:rPr>
+          <w:spacing w:val="52"/>
+        </w:rPr>
+        <w:t>EPILOG</w:t>
+      </w:r>
+    </w:p>
+    <w:p>
+      <w:bookmarkStart w:id="63457" w:name="kapitel_19"/>
       <w:pPr>
         <w:pStyle w:val="Heading1"/>
       </w:pPr>
       <w:r>
         <w:t>Der Anfang von etwas Größerem</w:t>
       </w:r>
-      <w:bookmarkEnd w:id="46989"/>
+      <w:bookmarkEnd w:id="63457"/>
     </w:p>
     <w:p>
       <w:pPr>
@@ -23556,6 +23613,21 @@
     <w:p/>
     <w:p>
       <w:pPr>
+        <w:spacing w:after="160"/>
+        <w:jc w:val="center"/>
+      </w:pPr>
+      <w:r>
+        <w:rPr>
+          <w:rFonts w:ascii="Georgia" w:hAnsi="Georgia"/>
+          <w:i/>
+          <w:sz w:val="22"/>
+        </w:rPr>
+        <w:t>Einfach den Code scannen und eine Bewertung dalassen:</w:t>
+      </w:r>
+    </w:p>
+    <w:p/>
+    <w:p>
+      <w:pPr>
         <w:spacing w:after="200"/>
         <w:jc w:val="center"/>
       </w:pPr>
@@ -23597,269 +23669,1383 @@
           <w:rFonts w:ascii="Georgia" w:hAnsi="Georgia"/>
           <w:color w:val="646464"/>
           <w:sz w:val="22"/>
-        </w:rPr>
-        <w:t>Vorschau</w:t>
-      </w:r>
-    </w:p>
-    <w:p>
-      <w:pPr>
-        <w:spacing w:after="400"/>
+          <w:spacing w:val="52"/>
+        </w:rPr>
+        <w:t>LESEPROBE</w:t>
+      </w:r>
+    </w:p>
+    <w:p>
+      <w:pPr>
+        <w:spacing w:after="40"/>
         <w:jc w:val="center"/>
       </w:pPr>
       <w:r>
         <w:rPr>
           <w:rFonts w:ascii="Georgia" w:hAnsi="Georgia"/>
+          <w:sz w:val="26"/>
+        </w:rPr>
+        <w:t>Die Herrenhaus-Detektive, Band 4</w:t>
+      </w:r>
+    </w:p>
+    <w:p>
+      <w:pPr>
+        <w:spacing w:line="240" w:lineRule="auto" w:after="360"/>
+        <w:jc w:val="center"/>
+      </w:pPr>
+      <w:r>
+        <w:rPr>
+          <w:rFonts w:ascii="Georgia" w:hAnsi="Georgia"/>
           <w:b/>
-          <w:sz w:val="28"/>
-        </w:rPr>
-        <w:t>Die Herrenhaus-Detektive, Band 4</w:t>
+          <w:sz w:val="36"/>
+        </w:rPr>
+        <w:t>Das versunkene Dorf</w:t>
+      </w:r>
+    </w:p>
+    <w:p>
+      <w:pPr>
+        <w:spacing w:after="120"/>
+        <w:jc w:val="center"/>
+      </w:pPr>
+      <w:r>
+        <w:rPr>
+          <w:rFonts w:ascii="Georgia" w:hAnsi="Georgia"/>
+          <w:color w:val="5A5A5A"/>
+          <w:sz w:val="22"/>
+          <w:spacing w:val="52"/>
+        </w:rPr>
+        <w:t>KAPITEL 1</w:t>
+      </w:r>
+    </w:p>
+    <w:p>
+      <w:pPr>
+        <w:spacing w:line="240" w:lineRule="auto" w:after="320"/>
+        <w:jc w:val="center"/>
+      </w:pPr>
+      <w:r>
+        <w:rPr>
+          <w:rFonts w:ascii="Georgia" w:hAnsi="Georgia"/>
+          <w:b/>
+          <w:sz w:val="30"/>
+        </w:rPr>
+        <w:t>Der Brief</w:t>
+      </w:r>
+    </w:p>
+    <w:p>
+      <w:pPr>
+        <w:spacing w:before="80" w:after="0"/>
+      </w:pPr>
+      <w:r>
+        <w:rPr>
+          <w:rFonts w:ascii="Georgia" w:hAnsi="Georgia"/>
+          <w:sz w:val="22"/>
+        </w:rPr>
+        <w:t>Jonas rannte.</w:t>
+      </w:r>
+    </w:p>
+    <w:p>
+      <w:pPr>
+        <w:spacing w:before="80" w:after="0"/>
+      </w:pPr>
+      <w:r>
+        <w:rPr>
+          <w:rFonts w:ascii="Georgia" w:hAnsi="Georgia"/>
+          <w:sz w:val="22"/>
+        </w:rPr>
+        <w:t>Der Weg von seinem Haus zum Marktplatz war nicht weit. Aber die Luft stand heiß zwischen den Häusern. Unter seinen Schuhen knirschte das trockene Gras am Wegrand.</w:t>
+      </w:r>
+    </w:p>
+    <w:p>
+      <w:pPr>
+        <w:spacing w:before="80" w:after="0"/>
+      </w:pPr>
+      <w:r>
+        <w:rPr>
+          <w:rFonts w:ascii="Georgia" w:hAnsi="Georgia"/>
+          <w:sz w:val="22"/>
+        </w:rPr>
+        <w:t>Seit drei Wochen hatte es nicht mehr geregnet. Das ganze Dorf war staubig und still.</w:t>
+      </w:r>
+    </w:p>
+    <w:p>
+      <w:pPr>
+        <w:spacing w:before="80" w:after="0"/>
+      </w:pPr>
+      <w:r>
+        <w:rPr>
+          <w:rFonts w:ascii="Georgia" w:hAnsi="Georgia"/>
+          <w:sz w:val="22"/>
+        </w:rPr>
+        <w:t>Mila und Ben saßen im Schatten der alten Eiche. Ben hatte seine rote Kappe tief ins Gesicht gezogen. Vor ihnen lagen drei Kastanien in einer ordentlichen Reihe im Sand. Sie hatten irgendein Spiel angefangen und wieder aufgegeben.</w:t>
+      </w:r>
+    </w:p>
+    <w:p>
+      <w:pPr>
+        <w:spacing w:before="80" w:after="0"/>
+      </w:pPr>
+      <w:r>
+        <w:rPr>
+          <w:rFonts w:ascii="Georgia" w:hAnsi="Georgia"/>
+          <w:sz w:val="22"/>
+        </w:rPr>
+        <w:t>„Da kommt er", sagte Mila.</w:t>
+      </w:r>
+    </w:p>
+    <w:p>
+      <w:pPr>
+        <w:spacing w:before="80" w:after="0"/>
+      </w:pPr>
+      <w:r>
+        <w:rPr>
+          <w:rFonts w:ascii="Georgia" w:hAnsi="Georgia"/>
+          <w:sz w:val="22"/>
+        </w:rPr>
+        <w:t>Jonas blieb vor ihnen stehen und stützte die Hände auf die Knie. Sein Hemd klebte ihm am Rücken.</w:t>
+      </w:r>
+    </w:p>
+    <w:p>
+      <w:pPr>
+        <w:spacing w:before="80" w:after="0"/>
+      </w:pPr>
+      <w:r>
+        <w:rPr>
+          <w:rFonts w:ascii="Georgia" w:hAnsi="Georgia"/>
+          <w:sz w:val="22"/>
+        </w:rPr>
+        <w:t>Er wollte etwas sagen.</w:t>
+      </w:r>
+    </w:p>
+    <w:p>
+      <w:pPr>
+        <w:spacing w:before="80" w:after="0"/>
+      </w:pPr>
+      <w:r>
+        <w:rPr>
+          <w:rFonts w:ascii="Georgia" w:hAnsi="Georgia"/>
+          <w:sz w:val="22"/>
+        </w:rPr>
+        <w:t>Es ging nicht.</w:t>
+      </w:r>
+    </w:p>
+    <w:p>
+      <w:pPr>
+        <w:spacing w:before="80" w:after="0"/>
+      </w:pPr>
+      <w:r>
+        <w:rPr>
+          <w:rFonts w:ascii="Georgia" w:hAnsi="Georgia"/>
+          <w:sz w:val="22"/>
+        </w:rPr>
+        <w:t>Er hielt nur den Umschlag hoch und atmete.</w:t>
+      </w:r>
+    </w:p>
+    <w:p>
+      <w:pPr>
+        <w:spacing w:before="80" w:after="0"/>
+      </w:pPr>
+      <w:r>
+        <w:rPr>
+          <w:rFonts w:ascii="Georgia" w:hAnsi="Georgia"/>
+          <w:sz w:val="22"/>
+        </w:rPr>
+        <w:t>„Bist du gerannt?" fragte Ben. „Bei der Hitze?"</w:t>
+      </w:r>
+    </w:p>
+    <w:p>
+      <w:pPr>
+        <w:spacing w:before="80" w:after="0"/>
+      </w:pPr>
+      <w:r>
+        <w:rPr>
+          <w:rFonts w:ascii="Georgia" w:hAnsi="Georgia"/>
+          <w:sz w:val="22"/>
+        </w:rPr>
+        <w:t>Jonas nickte.</w:t>
+      </w:r>
+    </w:p>
+    <w:p>
+      <w:pPr>
+        <w:spacing w:before="80" w:after="0"/>
+      </w:pPr>
+      <w:r>
+        <w:rPr>
+          <w:rFonts w:ascii="Georgia" w:hAnsi="Georgia"/>
+          <w:sz w:val="22"/>
+        </w:rPr>
+        <w:t>„Freiwillig?"</w:t>
+      </w:r>
+    </w:p>
+    <w:p>
+      <w:pPr>
+        <w:spacing w:before="80" w:after="0"/>
+      </w:pPr>
+      <w:r>
+        <w:rPr>
+          <w:rFonts w:ascii="Georgia" w:hAnsi="Georgia"/>
+          <w:sz w:val="22"/>
+        </w:rPr>
+        <w:t>Jonas nickte wieder.</w:t>
+      </w:r>
+    </w:p>
+    <w:p>
+      <w:pPr>
+        <w:spacing w:before="80" w:after="0"/>
+      </w:pPr>
+      <w:r>
+        <w:rPr>
+          <w:rFonts w:ascii="Georgia" w:hAnsi="Georgia"/>
+          <w:sz w:val="22"/>
+        </w:rPr>
+        <w:t>Mila stand auf und wischte sich den Sand von der Hose. Sie nahm ihm den Umschlag aus der Hand und drehte ihn um.</w:t>
+      </w:r>
+    </w:p>
+    <w:p>
+      <w:pPr>
+        <w:spacing w:before="80" w:after="0"/>
+      </w:pPr>
+      <w:r>
+        <w:rPr>
+          <w:rFonts w:ascii="Georgia" w:hAnsi="Georgia"/>
+          <w:sz w:val="22"/>
+        </w:rPr>
+        <w:t>Dann wurde sie ganz still.</w:t>
+      </w:r>
+    </w:p>
+    <w:p>
+      <w:pPr>
+        <w:spacing w:before="120" w:after="120"/>
+        <w:jc w:val="center"/>
+      </w:pPr>
+      <w:r>
+        <w:rPr>
+          <w:rFonts w:ascii="Georgia" w:hAnsi="Georgia"/>
+          <w:sz w:val="22"/>
+        </w:rPr>
+        <w:t>* * *</w:t>
+      </w:r>
+    </w:p>
+    <w:p>
+      <w:pPr>
+        <w:spacing w:before="80" w:after="0"/>
+      </w:pPr>
+      <w:r>
+        <w:rPr>
+          <w:rFonts w:ascii="Georgia" w:hAnsi="Georgia"/>
+          <w:sz w:val="22"/>
+        </w:rPr>
+        <w:t>Auf dem Umschlag stand nur:</w:t>
+      </w:r>
+    </w:p>
+    <w:p>
+      <w:pPr>
+        <w:spacing w:before="80" w:after="0"/>
+      </w:pPr>
+      <w:r>
+        <w:rPr>
+          <w:rFonts w:ascii="Georgia" w:hAnsi="Georgia"/>
+          <w:sz w:val="22"/>
+        </w:rPr>
+        <w:t>*</w:t>
+      </w:r>
+      <w:r>
+        <w:rPr>
+          <w:rFonts w:ascii="Georgia" w:hAnsi="Georgia"/>
+          <w:i/>
+          <w:sz w:val="22"/>
+        </w:rPr>
+        <w:t>DIE HERRENHAUS-DETEKTIVE</w:t>
+      </w:r>
+      <w:r>
+        <w:rPr>
+          <w:rFonts w:ascii="Georgia" w:hAnsi="Georgia"/>
+          <w:sz w:val="22"/>
+        </w:rPr>
+      </w:r>
+      <w:r>
+        <w:rPr>
+          <w:rFonts w:ascii="Georgia" w:hAnsi="Georgia"/>
+          <w:i/>
+          <w:sz w:val="22"/>
+        </w:rPr>
+        <w:t xml:space="preserve"> </w:t>
+      </w:r>
+      <w:r>
+        <w:rPr>
+          <w:rFonts w:ascii="Georgia" w:hAnsi="Georgia"/>
+          <w:sz w:val="22"/>
+        </w:rPr>
+      </w:r>
+      <w:r>
+        <w:rPr>
+          <w:rFonts w:ascii="Georgia" w:hAnsi="Georgia"/>
+          <w:i/>
+          <w:sz w:val="22"/>
+        </w:rPr>
+        <w:t>EICHENHAIN</w:t>
+      </w:r>
+      <w:r>
+        <w:rPr>
+          <w:rFonts w:ascii="Georgia" w:hAnsi="Georgia"/>
+          <w:sz w:val="22"/>
+        </w:rPr>
+        <w:t>*</w:t>
+      </w:r>
+    </w:p>
+    <w:p>
+      <w:pPr>
+        <w:spacing w:before="80" w:after="0"/>
+      </w:pPr>
+      <w:r>
+        <w:rPr>
+          <w:rFonts w:ascii="Georgia" w:hAnsi="Georgia"/>
+          <w:sz w:val="22"/>
+        </w:rPr>
+        <w:t>Mehr nicht. Keine Straße. Keine Hausnummer.</w:t>
+      </w:r>
+    </w:p>
+    <w:p>
+      <w:pPr>
+        <w:spacing w:before="80" w:after="0"/>
+      </w:pPr>
+      <w:r>
+        <w:rPr>
+          <w:rFonts w:ascii="Georgia" w:hAnsi="Georgia"/>
+          <w:sz w:val="22"/>
+        </w:rPr>
+        <w:t>Die Buchstaben waren krakelig, als hätte jemand sie sehr langsam geschrieben.</w:t>
+      </w:r>
+    </w:p>
+    <w:p>
+      <w:pPr>
+        <w:spacing w:before="80" w:after="0"/>
+      </w:pPr>
+      <w:r>
+        <w:rPr>
+          <w:rFonts w:ascii="Georgia" w:hAnsi="Georgia"/>
+          <w:sz w:val="22"/>
+        </w:rPr>
+        <w:t>Jonas ließ sich neben Ben ins Gras fallen und bekam endlich wieder Luft.</w:t>
+      </w:r>
+    </w:p>
+    <w:p>
+      <w:pPr>
+        <w:spacing w:before="80" w:after="0"/>
+      </w:pPr>
+      <w:r>
+        <w:rPr>
+          <w:rFonts w:ascii="Georgia" w:hAnsi="Georgia"/>
+          <w:sz w:val="22"/>
+        </w:rPr>
+        <w:t>„Der Briefträger hat gefragt, ob wir das sind."</w:t>
+      </w:r>
+    </w:p>
+    <w:p>
+      <w:pPr>
+        <w:spacing w:before="80" w:after="0"/>
+      </w:pPr>
+      <w:r>
+        <w:rPr>
+          <w:rFonts w:ascii="Georgia" w:hAnsi="Georgia"/>
+          <w:sz w:val="22"/>
+        </w:rPr>
+        <w:t>„Und?" Mila drehte den Umschlag weiter in den Händen.</w:t>
+      </w:r>
+    </w:p>
+    <w:p>
+      <w:pPr>
+        <w:spacing w:before="80" w:after="0"/>
+      </w:pPr>
+      <w:r>
+        <w:rPr>
+          <w:rFonts w:ascii="Georgia" w:hAnsi="Georgia"/>
+          <w:sz w:val="22"/>
+        </w:rPr>
+        <w:t>„Meine Mutter hat gelacht. Ich habe ja gesagt."</w:t>
+      </w:r>
+    </w:p>
+    <w:p>
+      <w:pPr>
+        <w:spacing w:before="80" w:after="0"/>
+      </w:pPr>
+      <w:r>
+        <w:rPr>
+          <w:rFonts w:ascii="Georgia" w:hAnsi="Georgia"/>
+          <w:sz w:val="22"/>
+        </w:rPr>
+        <w:t>Ben schob die Kappe hoch und las die zwei Wörter, dann noch einmal.</w:t>
+      </w:r>
+    </w:p>
+    <w:p>
+      <w:pPr>
+        <w:spacing w:before="80" w:after="0"/>
+      </w:pPr>
+      <w:r>
+        <w:rPr>
+          <w:rFonts w:ascii="Georgia" w:hAnsi="Georgia"/>
+          <w:sz w:val="22"/>
+        </w:rPr>
+        <w:t>„Uns", murmelte er. „Der ist an uns."</w:t>
+      </w:r>
+    </w:p>
+    <w:p>
+      <w:pPr>
+        <w:spacing w:before="80" w:after="0"/>
+      </w:pPr>
+      <w:r>
+        <w:rPr>
+          <w:rFonts w:ascii="Georgia" w:hAnsi="Georgia"/>
+          <w:sz w:val="22"/>
+        </w:rPr>
+        <w:t>Jonas sah über den Platz.</w:t>
+      </w:r>
+    </w:p>
+    <w:p>
+      <w:pPr>
+        <w:spacing w:before="80" w:after="0"/>
+      </w:pPr>
+      <w:r>
+        <w:rPr>
+          <w:rFonts w:ascii="Georgia" w:hAnsi="Georgia"/>
+          <w:sz w:val="22"/>
+        </w:rPr>
+        <w:t xml:space="preserve">Am Brunnen glänzte die Gedenktafel in der Sonne. </w:t>
+      </w:r>
+      <w:r>
+        <w:rPr>
+          <w:rFonts w:ascii="Georgia" w:hAnsi="Georgia"/>
+          <w:i/>
+          <w:sz w:val="22"/>
+        </w:rPr>
+        <w:t>Eichenhain — Gegründet an der Heilquelle — Seit 1712.</w:t>
+      </w:r>
+      <w:r>
+        <w:rPr>
+          <w:rFonts w:ascii="Georgia" w:hAnsi="Georgia"/>
+          <w:sz w:val="22"/>
+        </w:rPr>
+      </w:r>
+    </w:p>
+    <w:p>
+      <w:pPr>
+        <w:spacing w:before="80" w:after="0"/>
+      </w:pPr>
+      <w:r>
+        <w:rPr>
+          <w:rFonts w:ascii="Georgia" w:hAnsi="Georgia"/>
+          <w:sz w:val="22"/>
+        </w:rPr>
+        <w:t>Und schräg gegenüber, in Meiers Schaufenster, hing immer noch der Zeitungsausschnitt vom letzten Herbst. Das Papier war gelb geworden, das Foto krumm eingeklebt.</w:t>
+      </w:r>
+    </w:p>
+    <w:p>
+      <w:pPr>
+        <w:spacing w:before="80" w:after="0"/>
+      </w:pPr>
+      <w:r>
+        <w:rPr>
+          <w:rFonts w:ascii="Georgia" w:hAnsi="Georgia"/>
+          <w:sz w:val="22"/>
+        </w:rPr>
+        <w:t>Drei Kinder am Brunnenrand.</w:t>
+      </w:r>
+    </w:p>
+    <w:p>
+      <w:pPr>
+        <w:spacing w:before="80" w:after="0"/>
+      </w:pPr>
+      <w:r>
+        <w:rPr>
+          <w:rFonts w:ascii="Georgia" w:hAnsi="Georgia"/>
+          <w:sz w:val="22"/>
+        </w:rPr>
+        <w:t>Ben fand das großartig. Mila fand es peinlich. Meier hatte gesagt, der bleibe da, solange er den Laden habe.</w:t>
+      </w:r>
+    </w:p>
+    <w:p>
+      <w:pPr>
+        <w:spacing w:before="80" w:after="0"/>
+      </w:pPr>
+      <w:r>
+        <w:rPr>
+          <w:rFonts w:ascii="Georgia" w:hAnsi="Georgia"/>
+          <w:sz w:val="22"/>
+        </w:rPr>
+        <w:t>„Deshalb bin ich ja gerannt."</w:t>
+      </w:r>
+    </w:p>
+    <w:p>
+      <w:pPr>
+        <w:spacing w:before="80" w:after="0"/>
+      </w:pPr>
+      <w:r>
+        <w:rPr>
+          <w:rFonts w:ascii="Georgia" w:hAnsi="Georgia"/>
+          <w:sz w:val="22"/>
+        </w:rPr>
+        <w:t>Mila hielt den Umschlag gegen die Sonne. „Der ist noch zu."</w:t>
+      </w:r>
+    </w:p>
+    <w:p>
+      <w:pPr>
+        <w:spacing w:before="80" w:after="0"/>
+      </w:pPr>
+      <w:r>
+        <w:rPr>
+          <w:rFonts w:ascii="Georgia" w:hAnsi="Georgia"/>
+          <w:sz w:val="22"/>
+        </w:rPr>
+        <w:t>„Ich weiß."</w:t>
+      </w:r>
+    </w:p>
+    <w:p>
+      <w:pPr>
+        <w:spacing w:before="80" w:after="0"/>
+      </w:pPr>
+      <w:r>
+        <w:rPr>
+          <w:rFonts w:ascii="Georgia" w:hAnsi="Georgia"/>
+          <w:sz w:val="22"/>
+        </w:rPr>
+        <w:t>„Du hast ihn nicht aufgemacht?"</w:t>
+      </w:r>
+    </w:p>
+    <w:p>
+      <w:pPr>
+        <w:spacing w:before="80" w:after="0"/>
+      </w:pPr>
+      <w:r>
+        <w:rPr>
+          <w:rFonts w:ascii="Georgia" w:hAnsi="Georgia"/>
+          <w:sz w:val="22"/>
+        </w:rPr>
+        <w:t>Jonas zupfte einen Grashalm aus dem Boden. „Er ist ja nicht nur an mich."</w:t>
+      </w:r>
+    </w:p>
+    <w:p>
+      <w:pPr>
+        <w:spacing w:before="80" w:after="0"/>
+      </w:pPr>
+      <w:r>
+        <w:rPr>
+          <w:rFonts w:ascii="Georgia" w:hAnsi="Georgia"/>
+          <w:sz w:val="22"/>
+        </w:rPr>
+        <w:t>Mila sah ihn einen Moment lang an. Dann nickte sie kurz und legte ihm den Umschlag auf die Knie.</w:t>
+      </w:r>
+    </w:p>
+    <w:p>
+      <w:pPr>
+        <w:spacing w:before="80" w:after="0"/>
+      </w:pPr>
+      <w:r>
+        <w:rPr>
+          <w:rFonts w:ascii="Georgia" w:hAnsi="Georgia"/>
+          <w:sz w:val="22"/>
+        </w:rPr>
+        <w:t>Sie rückten enger zusammen. Eine Ameise lief über Bens Schuh, und er zog den Fuß weg.</w:t>
+      </w:r>
+    </w:p>
+    <w:p>
+      <w:pPr>
+        <w:spacing w:before="80" w:after="0"/>
+      </w:pPr>
+      <w:r>
+        <w:rPr>
+          <w:rFonts w:ascii="Georgia" w:hAnsi="Georgia"/>
+          <w:sz w:val="22"/>
+        </w:rPr>
+        <w:t>Jonas riss den Umschlag auf.</w:t>
+      </w:r>
+    </w:p>
+    <w:p>
+      <w:pPr>
+        <w:spacing w:before="80" w:after="0"/>
+      </w:pPr>
+      <w:r>
+        <w:rPr>
+          <w:rFonts w:ascii="Georgia" w:hAnsi="Georgia"/>
+          <w:sz w:val="22"/>
+        </w:rPr>
+        <w:t>Darin lag ein einzelnes Blatt aus einem Schulheft. Kariert, an einer Seite ausgefranst.</w:t>
+      </w:r>
+    </w:p>
+    <w:p>
+      <w:pPr>
+        <w:spacing w:before="80" w:after="0"/>
+      </w:pPr>
+      <w:r>
+        <w:rPr>
+          <w:rFonts w:ascii="Georgia" w:hAnsi="Georgia"/>
+          <w:sz w:val="22"/>
+        </w:rPr>
+        <w:t>Dieselbe krakelige Schrift.</w:t>
+      </w:r>
+    </w:p>
+    <w:p>
+      <w:pPr>
+        <w:spacing w:before="80" w:after="0"/>
+      </w:pPr>
+      <w:r>
+        <w:rPr>
+          <w:rFonts w:ascii="Georgia" w:hAnsi="Georgia"/>
+          <w:sz w:val="22"/>
+        </w:rPr>
+        <w:t>*Ich habe von euch gelesen. In der Zeitung.</w:t>
+      </w:r>
+    </w:p>
+    <w:p>
+      <w:pPr>
+        <w:spacing w:before="80" w:after="0"/>
+      </w:pPr>
+      <w:r>
+        <w:rPr>
+          <w:rFonts w:ascii="Georgia" w:hAnsi="Georgia"/>
+          <w:sz w:val="22"/>
+        </w:rPr>
+        <w:t>Bei uns ist etwas aufgetaucht. Und niemand hier will darüber reden.</w:t>
+      </w:r>
+    </w:p>
+    <w:p>
+      <w:pPr>
+        <w:spacing w:before="80" w:after="0"/>
+      </w:pPr>
+      <w:r>
+        <w:rPr>
+          <w:rFonts w:ascii="Georgia" w:hAnsi="Georgia"/>
+          <w:sz w:val="22"/>
+        </w:rPr>
+        <w:t>Ich weiß nicht, wen ich sonst fragen soll.*</w:t>
+      </w:r>
+    </w:p>
+    <w:p>
+      <w:pPr>
+        <w:spacing w:before="80" w:after="0"/>
+      </w:pPr>
+      <w:r>
+        <w:rPr>
+          <w:rFonts w:ascii="Georgia" w:hAnsi="Georgia"/>
+          <w:sz w:val="22"/>
+        </w:rPr>
+        <w:t>Kein Name. Kein Absender. Nichts.</w:t>
+      </w:r>
+    </w:p>
+    <w:p>
+      <w:pPr>
+        <w:spacing w:before="120" w:after="120"/>
+        <w:jc w:val="center"/>
+      </w:pPr>
+      <w:r>
+        <w:rPr>
+          <w:rFonts w:ascii="Georgia" w:hAnsi="Georgia"/>
+          <w:sz w:val="22"/>
+        </w:rPr>
+        <w:t>* * *</w:t>
+      </w:r>
+    </w:p>
+    <w:p>
+      <w:pPr>
+        <w:spacing w:before="80" w:after="0"/>
+      </w:pPr>
+      <w:r>
+        <w:rPr>
+          <w:rFonts w:ascii="Georgia" w:hAnsi="Georgia"/>
+          <w:sz w:val="22"/>
+        </w:rPr>
+        <w:t>Eine Weile sagte keiner etwas.</w:t>
+      </w:r>
+    </w:p>
+    <w:p>
+      <w:pPr>
+        <w:spacing w:before="80" w:after="0"/>
+      </w:pPr>
+      <w:r>
+        <w:rPr>
+          <w:rFonts w:ascii="Georgia" w:hAnsi="Georgia"/>
+          <w:sz w:val="22"/>
+        </w:rPr>
+        <w:t>Über ihnen raschelten die Blätter der Eiche. Irgendwo hinter den Häusern hämmerte jemand auf Holz.</w:t>
+      </w:r>
+    </w:p>
+    <w:p>
+      <w:pPr>
+        <w:spacing w:before="80" w:after="0"/>
+      </w:pPr>
+      <w:r>
+        <w:rPr>
+          <w:rFonts w:ascii="Georgia" w:hAnsi="Georgia"/>
+          <w:sz w:val="22"/>
+        </w:rPr>
+        <w:t>„Das ist ein Fall", sagte Mila. Ihre Stimme klang anders als sonst. „Das ist ein richtiger Fall."</w:t>
+      </w:r>
+    </w:p>
+    <w:p>
+      <w:pPr>
+        <w:spacing w:before="80" w:after="0"/>
+      </w:pPr>
+      <w:r>
+        <w:rPr>
+          <w:rFonts w:ascii="Georgia" w:hAnsi="Georgia"/>
+          <w:sz w:val="22"/>
+        </w:rPr>
+        <w:t>„Das ist ein Streich", brummte Ben.</w:t>
+      </w:r>
+    </w:p>
+    <w:p>
+      <w:pPr>
+        <w:spacing w:before="80" w:after="0"/>
+      </w:pPr>
+      <w:r>
+        <w:rPr>
+          <w:rFonts w:ascii="Georgia" w:hAnsi="Georgia"/>
+          <w:sz w:val="22"/>
+        </w:rPr>
+        <w:t>Mila drehte den Kopf. „Was?"</w:t>
+      </w:r>
+    </w:p>
+    <w:p>
+      <w:pPr>
+        <w:spacing w:before="80" w:after="0"/>
+      </w:pPr>
+      <w:r>
+        <w:rPr>
+          <w:rFonts w:ascii="Georgia" w:hAnsi="Georgia"/>
+          <w:sz w:val="22"/>
+        </w:rPr>
+        <w:t>„Überleg doch mal." Ben setzte sich gerade hin und schob eine Kastanie mit dem Schuh weg. „Wir standen in der Zeitung. Mit Namen. Mit Foto."</w:t>
+      </w:r>
+    </w:p>
+    <w:p>
+      <w:pPr>
+        <w:spacing w:before="80" w:after="0"/>
+      </w:pPr>
+      <w:r>
+        <w:rPr>
+          <w:rFonts w:ascii="Georgia" w:hAnsi="Georgia"/>
+          <w:sz w:val="22"/>
+        </w:rPr>
+        <w:t>„Na und?"</w:t>
+      </w:r>
+    </w:p>
+    <w:p>
+      <w:pPr>
+        <w:spacing w:before="80" w:after="0"/>
+      </w:pPr>
+      <w:r>
+        <w:rPr>
+          <w:rFonts w:ascii="Georgia" w:hAnsi="Georgia"/>
+          <w:sz w:val="22"/>
+        </w:rPr>
+        <w:t>„Das haben tausend Leute gelesen." Er zählte an den Fingern mit. „Jeder von denen kann so einen Brief schreiben. Man braucht ein Blatt Papier und eine Briefmarke."</w:t>
+      </w:r>
+    </w:p>
+    <w:p>
+      <w:pPr>
+        <w:spacing w:before="80" w:after="0"/>
+      </w:pPr>
+      <w:r>
+        <w:rPr>
+          <w:rFonts w:ascii="Georgia" w:hAnsi="Georgia"/>
+          <w:sz w:val="22"/>
+        </w:rPr>
+        <w:t>Jonas sah von einem zum anderen.</w:t>
+      </w:r>
+    </w:p>
+    <w:p>
+      <w:pPr>
+        <w:spacing w:before="80" w:after="0"/>
+      </w:pPr>
+      <w:r>
+        <w:rPr>
+          <w:rFonts w:ascii="Georgia" w:hAnsi="Georgia"/>
+          <w:sz w:val="22"/>
+        </w:rPr>
+        <w:t>„Und wenn nicht?" Mila stemmte die Hände in die Hüften.</w:t>
+      </w:r>
+    </w:p>
+    <w:p>
+      <w:pPr>
+        <w:spacing w:before="80" w:after="0"/>
+      </w:pPr>
+      <w:r>
+        <w:rPr>
+          <w:rFonts w:ascii="Georgia" w:hAnsi="Georgia"/>
+          <w:sz w:val="22"/>
+        </w:rPr>
+        <w:t>„Dann fahren wir irgendwohin", sagte Ben. „Und da steht dann ein Junge aus der achten Klasse und lacht sich kaputt."</w:t>
+      </w:r>
+    </w:p>
+    <w:p>
+      <w:pPr>
+        <w:spacing w:before="80" w:after="0"/>
+      </w:pPr>
+      <w:r>
+        <w:rPr>
+          <w:rFonts w:ascii="Georgia" w:hAnsi="Georgia"/>
+          <w:sz w:val="22"/>
+        </w:rPr>
+        <w:t>„Du willst also gar nichts machen."</w:t>
+      </w:r>
+    </w:p>
+    <w:p>
+      <w:pPr>
+        <w:spacing w:before="80" w:after="0"/>
+      </w:pPr>
+      <w:r>
+        <w:rPr>
+          <w:rFonts w:ascii="Georgia" w:hAnsi="Georgia"/>
+          <w:sz w:val="22"/>
+        </w:rPr>
+        <w:t>„Ich will nicht ausgelacht werden."</w:t>
+      </w:r>
+    </w:p>
+    <w:p>
+      <w:pPr>
+        <w:spacing w:before="80" w:after="0"/>
+      </w:pPr>
+      <w:r>
+        <w:rPr>
+          <w:rFonts w:ascii="Georgia" w:hAnsi="Georgia"/>
+          <w:sz w:val="22"/>
+        </w:rPr>
+        <w:t>„Das ist doch das Gleiche."</w:t>
+      </w:r>
+    </w:p>
+    <w:p>
+      <w:pPr>
+        <w:spacing w:before="80" w:after="0"/>
+      </w:pPr>
+      <w:r>
+        <w:rPr>
+          <w:rFonts w:ascii="Georgia" w:hAnsi="Georgia"/>
+          <w:sz w:val="22"/>
+        </w:rPr>
+        <w:t>„Das ist überhaupt nicht das Gleiche."</w:t>
+      </w:r>
+    </w:p>
+    <w:p>
+      <w:pPr>
+        <w:spacing w:before="80" w:after="0"/>
+      </w:pPr>
+      <w:r>
+        <w:rPr>
+          <w:rFonts w:ascii="Georgia" w:hAnsi="Georgia"/>
+          <w:sz w:val="22"/>
+        </w:rPr>
+        <w:t>Mila ließ sich auf die Wurzel fallen und verschränkte die Arme.</w:t>
+      </w:r>
+    </w:p>
+    <w:p>
+      <w:pPr>
+        <w:spacing w:before="80" w:after="0"/>
+      </w:pPr>
+      <w:r>
+        <w:rPr>
+          <w:rFonts w:ascii="Georgia" w:hAnsi="Georgia"/>
+          <w:sz w:val="22"/>
+        </w:rPr>
+        <w:t>Sie hätten noch lange so weitermachen können.</w:t>
+      </w:r>
+    </w:p>
+    <w:p>
+      <w:pPr>
+        <w:spacing w:before="80" w:after="0"/>
+      </w:pPr>
+      <w:r>
+        <w:rPr>
+          <w:rFonts w:ascii="Georgia" w:hAnsi="Georgia"/>
+          <w:sz w:val="22"/>
+        </w:rPr>
+        <w:t>Jonas hörte schon nicht mehr richtig zu. Er strich mit dem Daumen über das karierte Papier. Dann las er die vier Zeilen noch einmal.</w:t>
+      </w:r>
+    </w:p>
+    <w:p>
+      <w:pPr>
+        <w:spacing w:before="80" w:after="0"/>
+      </w:pPr>
+      <w:r>
+        <w:rPr>
+          <w:rFonts w:ascii="Georgia" w:hAnsi="Georgia"/>
+          <w:sz w:val="22"/>
+        </w:rPr>
+      </w:r>
+      <w:r>
+        <w:rPr>
+          <w:rFonts w:ascii="Georgia" w:hAnsi="Georgia"/>
+          <w:i/>
+          <w:sz w:val="22"/>
+        </w:rPr>
+        <w:t>Ich weiß nicht, wen ich sonst fragen soll.</w:t>
+      </w:r>
+      <w:r>
+        <w:rPr>
+          <w:rFonts w:ascii="Georgia" w:hAnsi="Georgia"/>
+          <w:sz w:val="22"/>
+        </w:rPr>
+      </w:r>
+    </w:p>
+    <w:p>
+      <w:pPr>
+        <w:spacing w:before="80" w:after="0"/>
+      </w:pPr>
+      <w:r>
+        <w:rPr>
+          <w:rFonts w:ascii="Georgia" w:hAnsi="Georgia"/>
+          <w:sz w:val="22"/>
+        </w:rPr>
+        <w:t>Er versuchte sich einen Jungen aus der achten Klasse vorzustellen, der so etwas schrieb. Es passte nicht.</w:t>
+      </w:r>
+    </w:p>
+    <w:p>
+      <w:pPr>
+        <w:spacing w:before="80" w:after="0"/>
+      </w:pPr>
+      <w:r>
+        <w:rPr>
+          <w:rFonts w:ascii="Georgia" w:hAnsi="Georgia"/>
+          <w:sz w:val="22"/>
+        </w:rPr>
+        <w:t>Aber Ben hatte trotzdem recht. Man konnte es nicht wissen. Nicht so.</w:t>
+      </w:r>
+    </w:p>
+    <w:p>
+      <w:pPr>
+        <w:spacing w:before="80" w:after="0"/>
+      </w:pPr>
+      <w:r>
+        <w:rPr>
+          <w:rFonts w:ascii="Georgia" w:hAnsi="Georgia"/>
+          <w:sz w:val="22"/>
+        </w:rPr>
+        <w:t>„Wir machen keins von beidem", sagte Jonas.</w:t>
+      </w:r>
+    </w:p>
+    <w:p>
+      <w:pPr>
+        <w:spacing w:before="80" w:after="0"/>
+      </w:pPr>
+      <w:r>
+        <w:rPr>
+          <w:rFonts w:ascii="Georgia" w:hAnsi="Georgia"/>
+          <w:sz w:val="22"/>
+        </w:rPr>
+        <w:t>Die beiden hörten auf zu streiten.</w:t>
+      </w:r>
+    </w:p>
+    <w:p>
+      <w:pPr>
+        <w:spacing w:before="80" w:after="0"/>
+      </w:pPr>
+      <w:r>
+        <w:rPr>
+          <w:rFonts w:ascii="Georgia" w:hAnsi="Georgia"/>
+          <w:sz w:val="22"/>
+        </w:rPr>
+        <w:t>„Wie — keins von beidem?"</w:t>
+      </w:r>
+    </w:p>
+    <w:p>
+      <w:pPr>
+        <w:spacing w:before="80" w:after="0"/>
+      </w:pPr>
+      <w:r>
+        <w:rPr>
+          <w:rFonts w:ascii="Georgia" w:hAnsi="Georgia"/>
+          <w:sz w:val="22"/>
+        </w:rPr>
+        <w:t>„Wir glauben es nicht, und wir werfen ihn nicht weg." Jonas legte das Blatt aufs Gras und beschwerte es mit einer Kastanie. „Wir sehen erst mal nach, wo er herkommt."</w:t>
+      </w:r>
+    </w:p>
+    <w:p>
+      <w:pPr>
+        <w:spacing w:before="80" w:after="0"/>
+      </w:pPr>
+      <w:r>
+        <w:rPr>
+          <w:rFonts w:ascii="Georgia" w:hAnsi="Georgia"/>
+          <w:sz w:val="22"/>
+        </w:rPr>
+        <w:t>Ben blinzelte. „Wie denn?"</w:t>
+      </w:r>
+    </w:p>
+    <w:p>
+      <w:pPr>
+        <w:spacing w:before="80" w:after="0"/>
+      </w:pPr>
+      <w:r>
+        <w:rPr>
+          <w:rFonts w:ascii="Georgia" w:hAnsi="Georgia"/>
+          <w:sz w:val="22"/>
+        </w:rPr>
+        <w:t>„Der Poststempel."</w:t>
+      </w:r>
+    </w:p>
+    <w:p>
+      <w:pPr>
+        <w:spacing w:before="80" w:after="0"/>
+      </w:pPr>
+      <w:r>
+        <w:rPr>
+          <w:rFonts w:ascii="Georgia" w:hAnsi="Georgia"/>
+          <w:sz w:val="22"/>
+        </w:rPr>
+        <w:t>Es wurde kurz still.</w:t>
+      </w:r>
+    </w:p>
+    <w:p>
+      <w:pPr>
+        <w:spacing w:before="80" w:after="0"/>
+      </w:pPr>
+      <w:r>
+        <w:rPr>
+          <w:rFonts w:ascii="Georgia" w:hAnsi="Georgia"/>
+          <w:sz w:val="22"/>
+        </w:rPr>
+        <w:t>„Oh", machte Ben.</w:t>
+      </w:r>
+    </w:p>
+    <w:p>
+      <w:pPr>
+        <w:spacing w:before="80" w:after="0"/>
+      </w:pPr>
+      <w:r>
+        <w:rPr>
+          <w:rFonts w:ascii="Georgia" w:hAnsi="Georgia"/>
+          <w:sz w:val="22"/>
+        </w:rPr>
+        <w:t>„Auf jedem Brief ist ein Stempel", erklärte Jonas. „Und auf jedem Stempel steht, wo er abgeschickt wurde."</w:t>
+      </w:r>
+    </w:p>
+    <w:p>
+      <w:pPr>
+        <w:spacing w:before="80" w:after="0"/>
+      </w:pPr>
+      <w:r>
+        <w:rPr>
+          <w:rFonts w:ascii="Georgia" w:hAnsi="Georgia"/>
+          <w:sz w:val="22"/>
+        </w:rPr>
+        <w:t>Mila grinste. „Manchmal bist du echt in Ordnung."</w:t>
+      </w:r>
+    </w:p>
+    <w:p>
+      <w:pPr>
+        <w:spacing w:before="80" w:after="0"/>
+      </w:pPr>
+      <w:r>
+        <w:rPr>
+          <w:rFonts w:ascii="Georgia" w:hAnsi="Georgia"/>
+          <w:sz w:val="22"/>
+        </w:rPr>
+        <w:t>„Manchmal?"</w:t>
+      </w:r>
+    </w:p>
+    <w:p>
+      <w:pPr>
+        <w:spacing w:before="80" w:after="0"/>
+      </w:pPr>
+      <w:r>
+        <w:rPr>
+          <w:rFonts w:ascii="Georgia" w:hAnsi="Georgia"/>
+          <w:sz w:val="22"/>
+        </w:rPr>
+        <w:t>„Sag ich doch."</w:t>
+      </w:r>
+    </w:p>
+    <w:p>
+      <w:pPr>
+        <w:spacing w:before="80" w:after="0"/>
+      </w:pPr>
+      <w:r>
+        <w:rPr>
+          <w:rFonts w:ascii="Georgia" w:hAnsi="Georgia"/>
+          <w:sz w:val="22"/>
+        </w:rPr>
+        <w:t>Ben sprang auf. „Ich hole meine Lupe. Die habe ich seit Weihnachten und noch nie gebraucht. Meine Oma fragt jedes Mal, ob ich sie schon benutzt habe."</w:t>
+      </w:r>
+    </w:p>
+    <w:p>
+      <w:pPr>
+        <w:spacing w:before="80" w:after="0"/>
+      </w:pPr>
+      <w:r>
+        <w:rPr>
+          <w:rFonts w:ascii="Georgia" w:hAnsi="Georgia"/>
+          <w:sz w:val="22"/>
+        </w:rPr>
+        <w:t>„Ben."</w:t>
+      </w:r>
+    </w:p>
+    <w:p>
+      <w:pPr>
+        <w:spacing w:before="80" w:after="0"/>
+      </w:pPr>
+      <w:r>
+        <w:rPr>
+          <w:rFonts w:ascii="Georgia" w:hAnsi="Georgia"/>
+          <w:sz w:val="22"/>
+        </w:rPr>
+        <w:t>„Was?"</w:t>
+      </w:r>
+    </w:p>
+    <w:p>
+      <w:pPr>
+        <w:spacing w:before="80" w:after="0"/>
+      </w:pPr>
+      <w:r>
+        <w:rPr>
+          <w:rFonts w:ascii="Georgia" w:hAnsi="Georgia"/>
+          <w:sz w:val="22"/>
+        </w:rPr>
+        <w:t>„Setz dich hin."</w:t>
+      </w:r>
+    </w:p>
+    <w:p>
+      <w:pPr>
+        <w:spacing w:before="80" w:after="0"/>
+      </w:pPr>
+      <w:r>
+        <w:rPr>
+          <w:rFonts w:ascii="Georgia" w:hAnsi="Georgia"/>
+          <w:sz w:val="22"/>
+        </w:rPr>
+        <w:t>Ben setzte sich hin.</w:t>
+      </w:r>
+    </w:p>
+    <w:p>
+      <w:pPr>
+        <w:spacing w:before="120" w:after="120"/>
+        <w:jc w:val="center"/>
+      </w:pPr>
+      <w:r>
+        <w:rPr>
+          <w:rFonts w:ascii="Georgia" w:hAnsi="Georgia"/>
+          <w:sz w:val="22"/>
+        </w:rPr>
+        <w:t>* * *</w:t>
+      </w:r>
+    </w:p>
+    <w:p>
+      <w:pPr>
+        <w:spacing w:before="80" w:after="0"/>
+      </w:pPr>
+      <w:r>
+        <w:rPr>
+          <w:rFonts w:ascii="Georgia" w:hAnsi="Georgia"/>
+          <w:sz w:val="22"/>
+        </w:rPr>
+        <w:t>Jonas nahm die Kastanie weg und drehte den Umschlag um.</w:t>
+      </w:r>
+    </w:p>
+    <w:p>
+      <w:pPr>
+        <w:spacing w:before="80" w:after="0"/>
+      </w:pPr>
+      <w:r>
+        <w:rPr>
+          <w:rFonts w:ascii="Georgia" w:hAnsi="Georgia"/>
+          <w:sz w:val="22"/>
+        </w:rPr>
+        <w:t>Er suchte den Stempel. Er war verwischt und grau, und gegen das Licht würde man ihn vielleicht lesen können.</w:t>
+      </w:r>
+    </w:p>
+    <w:p>
+      <w:pPr>
+        <w:spacing w:before="80" w:after="0"/>
+      </w:pPr>
+      <w:r>
+        <w:rPr>
+          <w:rFonts w:ascii="Georgia" w:hAnsi="Georgia"/>
+          <w:sz w:val="22"/>
+        </w:rPr>
+        <w:t>So weit kam er nicht.</w:t>
+      </w:r>
+    </w:p>
+    <w:p>
+      <w:pPr>
+        <w:spacing w:before="80" w:after="0"/>
+      </w:pPr>
+      <w:r>
+        <w:rPr>
+          <w:rFonts w:ascii="Georgia" w:hAnsi="Georgia"/>
+          <w:sz w:val="22"/>
+        </w:rPr>
+        <w:t>Denn ganz unten in der Ecke war noch etwas.</w:t>
+      </w:r>
+    </w:p>
+    <w:p>
+      <w:pPr>
+        <w:spacing w:before="80" w:after="0"/>
+      </w:pPr>
+      <w:r>
+        <w:rPr>
+          <w:rFonts w:ascii="Georgia" w:hAnsi="Georgia"/>
+          <w:sz w:val="22"/>
+        </w:rPr>
+        <w:t>Es war so klein, dass er es fast übersehen hätte. Mit demselben krakeligen Stift gezeichnet.</w:t>
+      </w:r>
+    </w:p>
+    <w:p>
+      <w:pPr>
+        <w:spacing w:before="80" w:after="0"/>
+      </w:pPr>
+      <w:r>
+        <w:rPr>
+          <w:rFonts w:ascii="Georgia" w:hAnsi="Georgia"/>
+          <w:sz w:val="22"/>
+        </w:rPr>
+        <w:t>Drei Wellen.</w:t>
+      </w:r>
+    </w:p>
+    <w:p>
+      <w:pPr>
+        <w:spacing w:before="80" w:after="0"/>
+      </w:pPr>
+      <w:r>
+        <w:rPr>
+          <w:rFonts w:ascii="Georgia" w:hAnsi="Georgia"/>
+          <w:sz w:val="22"/>
+        </w:rPr>
+        <w:t>Und darüber ein Stern. Ein Stern mit acht Spitzen.</w:t>
+      </w:r>
+    </w:p>
+    <w:p>
+      <w:pPr>
+        <w:spacing w:before="80" w:after="0"/>
+      </w:pPr>
+      <w:r>
+        <w:rPr>
+          <w:rFonts w:ascii="Georgia" w:hAnsi="Georgia"/>
+          <w:sz w:val="22"/>
+        </w:rPr>
+        <w:t>Jonas' Finger wurden ganz langsam.</w:t>
+      </w:r>
+    </w:p>
+    <w:p>
+      <w:pPr>
+        <w:spacing w:before="80" w:after="0"/>
+      </w:pPr>
+      <w:r>
+        <w:rPr>
+          <w:rFonts w:ascii="Georgia" w:hAnsi="Georgia"/>
+          <w:sz w:val="22"/>
+        </w:rPr>
+        <w:t>Er griff in seine Hosentasche.</w:t>
+      </w:r>
+    </w:p>
+    <w:p>
+      <w:pPr>
+        <w:spacing w:before="80" w:after="0"/>
+      </w:pPr>
+      <w:r>
+        <w:rPr>
+          <w:rFonts w:ascii="Georgia" w:hAnsi="Georgia"/>
+          <w:sz w:val="22"/>
+        </w:rPr>
+        <w:t>Die Münze war immer da. Seit dem Herbst trug er sie bei sich, jeden einzelnen Tag. Er dachte kaum noch darüber nach.</w:t>
+      </w:r>
+    </w:p>
+    <w:p>
+      <w:pPr>
+        <w:spacing w:before="80" w:after="0"/>
+      </w:pPr>
+      <w:r>
+        <w:rPr>
+          <w:rFonts w:ascii="Georgia" w:hAnsi="Georgia"/>
+          <w:sz w:val="22"/>
+        </w:rPr>
+        <w:t>Er legte sie neben die Zeichnung auf das karierte Papier.</w:t>
+      </w:r>
+    </w:p>
+    <w:p>
+      <w:pPr>
+        <w:spacing w:before="80" w:after="0"/>
+      </w:pPr>
+      <w:r>
+        <w:rPr>
+          <w:rFonts w:ascii="Georgia" w:hAnsi="Georgia"/>
+          <w:sz w:val="22"/>
+        </w:rPr>
+        <w:t>Ben beugte sich vor. Seine Kappe rutschte nach hinten und fiel ins Gras. Er hob sie nicht auf.</w:t>
+      </w:r>
+    </w:p>
+    <w:p>
+      <w:pPr>
+        <w:spacing w:before="80" w:after="0"/>
+      </w:pPr>
+      <w:r>
+        <w:rPr>
+          <w:rFonts w:ascii="Georgia" w:hAnsi="Georgia"/>
+          <w:sz w:val="22"/>
+        </w:rPr>
+        <w:t>Drei Wellen. Ein Stern mit acht Spitzen.</w:t>
+      </w:r>
+    </w:p>
+    <w:p>
+      <w:pPr>
+        <w:spacing w:before="80" w:after="0"/>
+      </w:pPr>
+      <w:r>
+        <w:rPr>
+          <w:rFonts w:ascii="Georgia" w:hAnsi="Georgia"/>
+          <w:sz w:val="22"/>
+        </w:rPr>
+        <w:t>Zweimal genau dasselbe Zeichen.</w:t>
+      </w:r>
+    </w:p>
+    <w:p>
+      <w:pPr>
+        <w:spacing w:before="80" w:after="0"/>
+      </w:pPr>
+      <w:r>
+        <w:rPr>
+          <w:rFonts w:ascii="Georgia" w:hAnsi="Georgia"/>
+          <w:sz w:val="22"/>
+        </w:rPr>
+        <w:t>„Das ist kein Streich", sagte Ben.</w:t>
+      </w:r>
+    </w:p>
+    <w:p>
+      <w:pPr>
+        <w:spacing w:before="80" w:after="0"/>
+      </w:pPr>
+      <w:r>
+        <w:rPr>
+          <w:rFonts w:ascii="Georgia" w:hAnsi="Georgia"/>
+          <w:sz w:val="22"/>
+        </w:rPr>
+        <w:t>Diesmal widersprach ihm keiner.</w:t>
+      </w:r>
+    </w:p>
+    <w:p>
+      <w:pPr>
+        <w:spacing w:before="280" w:after="280"/>
+        <w:jc w:val="center"/>
+      </w:pPr>
+      <w:r>
+        <w:rPr>
+          <w:rFonts w:ascii="Georgia" w:hAnsi="Georgia"/>
+          <w:color w:val="787878"/>
+          <w:sz w:val="24"/>
+        </w:rPr>
+        <w:t>[ … ]</w:t>
       </w:r>
     </w:p>
     <w:p>
       <w:pPr>
         <w:spacing w:after="40"/>
-        <w:ind w:left="454" w:right="454"/>
         <w:jc w:val="center"/>
       </w:pPr>
       <w:r>
         <w:rPr>
           <w:rFonts w:ascii="Georgia" w:hAnsi="Georgia"/>
-          <w:sz w:val="22"/>
-        </w:rPr>
-        <w:t>In Jonas' Tasche liegt eine Münze.</w:t>
-      </w:r>
-    </w:p>
-    <w:p>
-      <w:pPr>
-        <w:spacing w:after="40"/>
-        <w:ind w:left="454" w:right="454"/>
-        <w:jc w:val="center"/>
-      </w:pPr>
-      <w:r>
-        <w:rPr>
-          <w:rFonts w:ascii="Georgia" w:hAnsi="Georgia"/>
-          <w:sz w:val="22"/>
-        </w:rPr>
-        <w:t>Drei Wellen und ein Stern, in das Metall geprägt.</w:t>
-      </w:r>
-    </w:p>
-    <w:p>
-      <w:pPr>
-        <w:spacing w:after="40"/>
-        <w:ind w:left="454" w:right="454"/>
-        <w:jc w:val="center"/>
-      </w:pPr>
-    </w:p>
-    <w:p>
-      <w:pPr>
-        <w:spacing w:after="40"/>
-        <w:ind w:left="454" w:right="454"/>
-        <w:jc w:val="center"/>
-      </w:pPr>
-      <w:r>
-        <w:rPr>
-          <w:rFonts w:ascii="Georgia" w:hAnsi="Georgia"/>
-          <w:sz w:val="22"/>
-        </w:rPr>
-        <w:t>Es ist kein Zeichen aus Eichenhain.</w:t>
-      </w:r>
-    </w:p>
-    <w:p>
-      <w:pPr>
-        <w:spacing w:after="40"/>
-        <w:ind w:left="454" w:right="454"/>
-        <w:jc w:val="center"/>
-      </w:pPr>
-      <w:r>
-        <w:rPr>
-          <w:rFonts w:ascii="Georgia" w:hAnsi="Georgia"/>
-          <w:sz w:val="22"/>
-        </w:rPr>
-        <w:t>Kein Wappen, das die Kinder kennen.</w:t>
-      </w:r>
-    </w:p>
-    <w:p>
-      <w:pPr>
-        <w:spacing w:after="40"/>
-        <w:ind w:left="454" w:right="454"/>
-        <w:jc w:val="center"/>
-      </w:pPr>
-      <w:r>
-        <w:rPr>
-          <w:rFonts w:ascii="Georgia" w:hAnsi="Georgia"/>
-          <w:sz w:val="22"/>
-        </w:rPr>
-        <w:t>Auf dem alten Pergament fehlte genau dieses Stück.</w:t>
-      </w:r>
-    </w:p>
-    <w:p>
-      <w:pPr>
-        <w:spacing w:after="40"/>
-        <w:ind w:left="454" w:right="454"/>
-        <w:jc w:val="center"/>
-      </w:pPr>
-    </w:p>
-    <w:p>
-      <w:pPr>
-        <w:spacing w:after="40"/>
-        <w:ind w:left="454" w:right="454"/>
-        <w:jc w:val="center"/>
-      </w:pPr>
-      <w:r>
-        <w:rPr>
-          <w:rFonts w:ascii="Georgia" w:hAnsi="Georgia"/>
-          <w:sz w:val="22"/>
-        </w:rPr>
-        <w:t>Die vier Familien kamen von irgendwoher.</w:t>
-      </w:r>
-    </w:p>
-    <w:p>
-      <w:pPr>
-        <w:spacing w:after="40"/>
-        <w:ind w:left="454" w:right="454"/>
-        <w:jc w:val="center"/>
-      </w:pPr>
-      <w:r>
-        <w:rPr>
-          <w:rFonts w:ascii="Georgia" w:hAnsi="Georgia"/>
-          <w:sz w:val="22"/>
-        </w:rPr>
-        <w:t>Von weit her. Aus einem Ort, den niemand mehr nennt.</w:t>
-      </w:r>
-    </w:p>
-    <w:p>
-      <w:pPr>
-        <w:spacing w:after="40"/>
-        <w:ind w:left="454" w:right="454"/>
-        <w:jc w:val="center"/>
-      </w:pPr>
-    </w:p>
-    <w:p>
-      <w:pPr>
-        <w:spacing w:after="40"/>
-        <w:ind w:left="454" w:right="454"/>
-        <w:jc w:val="center"/>
-      </w:pPr>
-      <w:r>
-        <w:rPr>
-          <w:rFonts w:ascii="Georgia" w:hAnsi="Georgia"/>
-          <w:sz w:val="22"/>
-        </w:rPr>
-        <w:t>Und das Zeichen zeigt nach draußen.</w:t>
-      </w:r>
-    </w:p>
-    <w:p>
-      <w:pPr>
-        <w:spacing w:after="40"/>
-        <w:ind w:left="454" w:right="454"/>
-        <w:jc w:val="center"/>
-      </w:pPr>
-      <w:r>
-        <w:rPr>
-          <w:rFonts w:ascii="Georgia" w:hAnsi="Georgia"/>
-          <w:sz w:val="22"/>
-        </w:rPr>
-        <w:t>Weit hinter die Hügel.</w:t>
-      </w:r>
-    </w:p>
-    <w:p>
-      <w:pPr>
-        <w:spacing w:after="40"/>
-        <w:ind w:left="454" w:right="454"/>
-        <w:jc w:val="center"/>
-      </w:pPr>
-      <w:r>
-        <w:rPr>
-          <w:rFonts w:ascii="Georgia" w:hAnsi="Georgia"/>
-          <w:sz w:val="22"/>
-        </w:rPr>
-        <w:t>Dorthin, wo Jonas, Mila und Ben noch nie gewesen sind.</w:t>
-      </w:r>
-    </w:p>
-    <w:p>
-      <w:pPr>
-        <w:spacing w:after="40"/>
-        <w:ind w:left="454" w:right="454"/>
-        <w:jc w:val="center"/>
-      </w:pPr>
-    </w:p>
-    <w:p>
-      <w:pPr>
-        <w:spacing w:after="40"/>
-        <w:ind w:left="454" w:right="454"/>
-        <w:jc w:val="center"/>
-      </w:pPr>
-      <w:r>
-        <w:rPr>
-          <w:rFonts w:ascii="Georgia" w:hAnsi="Georgia"/>
-          <w:sz w:val="22"/>
-        </w:rPr>
-        <w:t>Manche Geschichten enden nicht.</w:t>
-      </w:r>
-    </w:p>
-    <w:p>
-      <w:pPr>
-        <w:spacing w:after="40"/>
-        <w:ind w:left="454" w:right="454"/>
-        <w:jc w:val="center"/>
-      </w:pPr>
-      <w:r>
-        <w:rPr>
-          <w:rFonts w:ascii="Georgia" w:hAnsi="Georgia"/>
-          <w:sz w:val="22"/>
-        </w:rPr>
-        <w:t>Sie warten nur auf jemanden,</w:t>
-      </w:r>
-    </w:p>
-    <w:p>
-      <w:pPr>
-        <w:spacing w:after="40"/>
-        <w:ind w:left="454" w:right="454"/>
-        <w:jc w:val="center"/>
-      </w:pPr>
-      <w:r>
-        <w:rPr>
-          <w:rFonts w:ascii="Georgia" w:hAnsi="Georgia"/>
-          <w:sz w:val="22"/>
-        </w:rPr>
-        <w:t>der mutig genug ist, die nächste Seite umzublättern.</w:t>
-      </w:r>
-    </w:p>
-    <w:p/>
-    <w:p>
-      <w:pPr>
-        <w:spacing w:before="120" w:after="280"/>
-        <w:jc w:val="center"/>
-      </w:pPr>
-      <w:r>
-        <w:rPr>
-          <w:rFonts w:ascii="Georgia" w:hAnsi="Georgia"/>
-          <w:sz w:val="22"/>
-        </w:rPr>
-        <w:t>* * *</w:t>
-      </w:r>
-    </w:p>
-    <w:p>
-      <w:pPr>
-        <w:spacing w:after="320"/>
-        <w:jc w:val="center"/>
-      </w:pPr>
-      <w:r>
-        <w:rPr>
-          <w:rFonts w:ascii="Georgia" w:hAnsi="Georgia"/>
           <w:i/>
           <w:sz w:val="22"/>
         </w:rPr>
-        <w:t>Woher kamen die vier Familien wirklich?</w:t>
-        <w:br/>
-        <w:t>Was bedeutet das fremde Zeichen?</w:t>
-        <w:br/>
-        <w:t>Und was wartet weit hinter den Hügeln?</w:t>
-      </w:r>
-    </w:p>
-    <w:p>
-      <w:pPr>
-        <w:spacing w:after="80"/>
+        <w:t>Wie es weitergeht, liest du in</w:t>
+      </w:r>
+    </w:p>
+    <w:p>
+      <w:pPr>
+        <w:spacing w:line="240" w:lineRule="auto" w:after="80"/>
         <w:jc w:val="center"/>
       </w:pPr>
       <w:r>
@@ -23868,7 +25054,7 @@
           <w:b/>
           <w:sz w:val="26"/>
         </w:rPr>
-        <w:t>Die Herrenhaus-Detektive, Band 4</w:t>
+        <w:t>Das versunkene Dorf</w:t>
       </w:r>
     </w:p>
     <w:p>
@@ -23878,10 +25064,9 @@
       <w:r>
         <w:rPr>
           <w:rFonts w:ascii="Georgia" w:hAnsi="Georgia"/>
-          <w:b/>
-          <w:sz w:val="24"/>
-        </w:rPr>
-        <w:t>Erscheint bald!</w:t>
+          <w:sz w:val="22"/>
+        </w:rPr>
+        <w:t>Das vierte große Abenteuer der Herrenhaus-Detektive.</w:t>
       </w:r>
     </w:p>
     <w:p>
@@ -24536,7 +25721,7 @@
       <w:keepNext/>
       <w:keepLines/>
       <w:pageBreakBefore w:val="0"/>
-      <w:spacing w:before="0" w:after="200"/>
+      <w:spacing w:before="0" w:after="440"/>
       <w:jc w:val="center"/>
       <w:outlineLvl w:val="0"/>
     </w:pPr>
@@ -24545,7 +25730,7 @@
       <w:b/>
       <w:bCs/>
       <w:color w:val="000000"/>
-      <w:sz w:val="28"/>
+      <w:sz w:val="34"/>
       <w:szCs w:val="28"/>
     </w:rPr>
   </w:style>
@@ -24561,7 +25746,7 @@
     <w:pPr>
       <w:keepNext/>
       <w:keepLines/>
-      <w:spacing w:before="0" w:after="40"/>
+      <w:spacing w:before="0" w:after="280"/>
       <w:jc w:val="center"/>
       <w:outlineLvl w:val="1"/>
     </w:pPr>
@@ -24569,7 +25754,7 @@
       <w:rFonts w:asciiTheme="majorHAnsi" w:eastAsiaTheme="majorEastAsia" w:hAnsiTheme="majorHAnsi" w:cstheme="majorBidi" w:ascii="Georgia" w:hAnsi="Georgia"/>
       <w:b w:val="0"/>
       <w:bCs/>
-      <w:color w:val="646464"/>
+      <w:color w:val="5A5A5A"/>
       <w:sz w:val="22"/>
       <w:szCs w:val="26"/>
     </w:rPr>

</xml_diff>

<commit_message>
Band 3: Rezensions-QR-Code (ASIN B0H5B5WSP5) erzeugt + im Manuskript verifiziert
Co-Authored-By: Claude Opus 4.8 <noreply@anthropic.com>
</commit_message>
<xml_diff>
--- a/Band_3/Linear/Manuskript.docx
+++ b/Band_3/Linear/Manuskript.docx
@@ -619,14 +619,14 @@
       </w:r>
     </w:p>
     <w:p>
-      <w:bookmarkStart w:id="93156" w:name="kapitel_1"/>
+      <w:bookmarkStart w:id="9427" w:name="kapitel_1"/>
       <w:pPr>
         <w:pStyle w:val="Heading1"/>
       </w:pPr>
       <w:r>
         <w:t>Das zweite X</w:t>
       </w:r>
-      <w:bookmarkEnd w:id="93156"/>
+      <w:bookmarkEnd w:id="9427"/>
     </w:p>
     <w:p>
       <w:pPr>
@@ -1944,14 +1944,14 @@
       </w:r>
     </w:p>
     <w:p>
-      <w:bookmarkStart w:id="65955" w:name="kapitel_2"/>
+      <w:bookmarkStart w:id="15571" w:name="kapitel_2"/>
       <w:pPr>
         <w:pStyle w:val="Heading1"/>
       </w:pPr>
       <w:r>
         <w:t>Der Mann mit der Axt</w:t>
       </w:r>
-      <w:bookmarkEnd w:id="65955"/>
+      <w:bookmarkEnd w:id="15571"/>
     </w:p>
     <w:p>
       <w:pPr>
@@ -3189,14 +3189,14 @@
       </w:r>
     </w:p>
     <w:p>
-      <w:bookmarkStart w:id="18443" w:name="kapitel_3"/>
+      <w:bookmarkStart w:id="79840" w:name="kapitel_3"/>
       <w:pPr>
         <w:pStyle w:val="Heading1"/>
       </w:pPr>
       <w:r>
         <w:t>Risse im Pflaster</w:t>
       </w:r>
-      <w:bookmarkEnd w:id="18443"/>
+      <w:bookmarkEnd w:id="79840"/>
     </w:p>
     <w:p>
       <w:pPr>
@@ -4692,14 +4692,14 @@
       </w:r>
     </w:p>
     <w:p>
-      <w:bookmarkStart w:id="8342" w:name="kapitel_4"/>
+      <w:bookmarkStart w:id="68218" w:name="kapitel_4"/>
       <w:pPr>
         <w:pStyle w:val="Heading1"/>
       </w:pPr>
       <w:r>
         <w:t>Der Brief von Winter</w:t>
       </w:r>
-      <w:bookmarkEnd w:id="8342"/>
+      <w:bookmarkEnd w:id="68218"/>
     </w:p>
     <w:p>
       <w:pPr>
@@ -6135,14 +6135,14 @@
       </w:r>
     </w:p>
     <w:p>
-      <w:bookmarkStart w:id="47519" w:name="kapitel_5"/>
+      <w:bookmarkStart w:id="42728" w:name="kapitel_5"/>
       <w:pPr>
         <w:pStyle w:val="Heading1"/>
       </w:pPr>
       <w:r>
         <w:t>Die verschwundene Linie</w:t>
       </w:r>
-      <w:bookmarkEnd w:id="47519"/>
+      <w:bookmarkEnd w:id="42728"/>
     </w:p>
     <w:p>
       <w:pPr>
@@ -7241,14 +7241,14 @@
       </w:r>
     </w:p>
     <w:p>
-      <w:bookmarkStart w:id="71177" w:name="kapitel_6"/>
+      <w:bookmarkStart w:id="14271" w:name="kapitel_6"/>
       <w:pPr>
         <w:pStyle w:val="Heading1"/>
       </w:pPr>
       <w:r>
         <w:t>Der Förster</w:t>
       </w:r>
-      <w:bookmarkEnd w:id="71177"/>
+      <w:bookmarkEnd w:id="14271"/>
     </w:p>
     <w:p>
       <w:pPr>
@@ -8560,14 +8560,14 @@
       </w:r>
     </w:p>
     <w:p>
-      <w:bookmarkStart w:id="71661" w:name="kapitel_7"/>
+      <w:bookmarkStart w:id="78807" w:name="kapitel_7"/>
       <w:pPr>
         <w:pStyle w:val="Heading1"/>
       </w:pPr>
       <w:r>
         <w:t>Hohler Boden</w:t>
       </w:r>
-      <w:bookmarkEnd w:id="71661"/>
+      <w:bookmarkEnd w:id="78807"/>
     </w:p>
     <w:p>
       <w:pPr>
@@ -9796,14 +9796,14 @@
       </w:r>
     </w:p>
     <w:p>
-      <w:bookmarkStart w:id="56284" w:name="kapitel_8"/>
+      <w:bookmarkStart w:id="71508" w:name="kapitel_8"/>
       <w:pPr>
         <w:pStyle w:val="Heading1"/>
       </w:pPr>
       <w:r>
         <w:t>Das alte Wehr</w:t>
       </w:r>
-      <w:bookmarkEnd w:id="56284"/>
+      <w:bookmarkEnd w:id="71508"/>
     </w:p>
     <w:p>
       <w:pPr>
@@ -10984,14 +10984,14 @@
       </w:r>
     </w:p>
     <w:p>
-      <w:bookmarkStart w:id="9094" w:name="kapitel_9"/>
+      <w:bookmarkStart w:id="69972" w:name="kapitel_9"/>
       <w:pPr>
         <w:pStyle w:val="Heading1"/>
       </w:pPr>
       <w:r>
         <w:t>Der Weg zurück</w:t>
       </w:r>
-      <w:bookmarkEnd w:id="9094"/>
+      <w:bookmarkEnd w:id="69972"/>
     </w:p>
     <w:p>
       <w:pPr>
@@ -12268,14 +12268,14 @@
       </w:r>
     </w:p>
     <w:p>
-      <w:bookmarkStart w:id="40840" w:name="kapitel_10"/>
+      <w:bookmarkStart w:id="82310" w:name="kapitel_10"/>
       <w:pPr>
         <w:pStyle w:val="Heading1"/>
       </w:pPr>
       <w:r>
         <w:t>Zurück im Dorf</w:t>
       </w:r>
-      <w:bookmarkEnd w:id="40840"/>
+      <w:bookmarkEnd w:id="82310"/>
     </w:p>
     <w:p>
       <w:pPr>
@@ -13443,14 +13443,14 @@
       </w:r>
     </w:p>
     <w:p>
-      <w:bookmarkStart w:id="66752" w:name="kapitel_11"/>
+      <w:bookmarkStart w:id="82669" w:name="kapitel_11"/>
       <w:pPr>
         <w:pStyle w:val="Heading1"/>
       </w:pPr>
       <w:r>
         <w:t>Der erste Versuch</w:t>
       </w:r>
-      <w:bookmarkEnd w:id="66752"/>
+      <w:bookmarkEnd w:id="82669"/>
     </w:p>
     <w:p>
       <w:pPr>
@@ -14546,14 +14546,14 @@
       </w:r>
     </w:p>
     <w:p>
-      <w:bookmarkStart w:id="45279" w:name="kapitel_12"/>
+      <w:bookmarkStart w:id="69960" w:name="kapitel_12"/>
       <w:pPr>
         <w:pStyle w:val="Heading1"/>
       </w:pPr>
       <w:r>
         <w:t>Jetzt regnet es</w:t>
       </w:r>
-      <w:bookmarkEnd w:id="45279"/>
+      <w:bookmarkEnd w:id="69960"/>
     </w:p>
     <w:p>
       <w:pPr>
@@ -15506,14 +15506,14 @@
       </w:r>
     </w:p>
     <w:p>
-      <w:bookmarkStart w:id="16512" w:name="kapitel_13"/>
+      <w:bookmarkStart w:id="45303" w:name="kapitel_13"/>
       <w:pPr>
         <w:pStyle w:val="Heading1"/>
       </w:pPr>
       <w:r>
         <w:t>Bens Idee am Wehr</w:t>
       </w:r>
-      <w:bookmarkEnd w:id="16512"/>
+      <w:bookmarkEnd w:id="45303"/>
     </w:p>
     <w:p>
       <w:pPr>
@@ -16538,14 +16538,14 @@
       </w:r>
     </w:p>
     <w:p>
-      <w:bookmarkStart w:id="3683" w:name="kapitel_14"/>
+      <w:bookmarkStart w:id="32789" w:name="kapitel_14"/>
       <w:pPr>
         <w:pStyle w:val="Heading1"/>
       </w:pPr>
       <w:r>
         <w:t>Vier Hände</w:t>
       </w:r>
-      <w:bookmarkEnd w:id="3683"/>
+      <w:bookmarkEnd w:id="32789"/>
     </w:p>
     <w:p>
       <w:pPr>
@@ -17666,14 +17666,14 @@
       </w:r>
     </w:p>
     <w:p>
-      <w:bookmarkStart w:id="92934" w:name="kapitel_15"/>
+      <w:bookmarkStart w:id="43852" w:name="kapitel_15"/>
       <w:pPr>
         <w:pStyle w:val="Heading1"/>
       </w:pPr>
       <w:r>
         <w:t>Heinrich Winter</w:t>
       </w:r>
-      <w:bookmarkEnd w:id="92934"/>
+      <w:bookmarkEnd w:id="43852"/>
     </w:p>
     <w:p>
       <w:pPr>
@@ -18892,14 +18892,14 @@
       </w:r>
     </w:p>
     <w:p>
-      <w:bookmarkStart w:id="26419" w:name="kapitel_16"/>
+      <w:bookmarkStart w:id="91140" w:name="kapitel_16"/>
       <w:pPr>
         <w:pStyle w:val="Heading1"/>
       </w:pPr>
       <w:r>
         <w:t>Das letzte Zittern</w:t>
       </w:r>
-      <w:bookmarkEnd w:id="26419"/>
+      <w:bookmarkEnd w:id="91140"/>
     </w:p>
     <w:p>
       <w:pPr>
@@ -20056,14 +20056,14 @@
       </w:r>
     </w:p>
     <w:p>
-      <w:bookmarkStart w:id="60638" w:name="kapitel_17"/>
+      <w:bookmarkStart w:id="69844" w:name="kapitel_17"/>
       <w:pPr>
         <w:pStyle w:val="Heading1"/>
       </w:pPr>
       <w:r>
         <w:t>Das Dorf atmet auf</w:t>
       </w:r>
-      <w:bookmarkEnd w:id="60638"/>
+      <w:bookmarkEnd w:id="69844"/>
     </w:p>
     <w:p>
       <w:pPr>
@@ -21245,14 +21245,14 @@
       </w:r>
     </w:p>
     <w:p>
-      <w:bookmarkStart w:id="55211" w:name="kapitel_18"/>
+      <w:bookmarkStart w:id="51591" w:name="kapitel_18"/>
       <w:pPr>
         <w:pStyle w:val="Heading1"/>
       </w:pPr>
       <w:r>
         <w:t>Der Förster und der Wald</w:t>
       </w:r>
-      <w:bookmarkEnd w:id="55211"/>
+      <w:bookmarkEnd w:id="51591"/>
     </w:p>
     <w:p>
       <w:pPr>
@@ -22361,14 +22361,14 @@
       </w:r>
     </w:p>
     <w:p>
-      <w:bookmarkStart w:id="63457" w:name="kapitel_19"/>
+      <w:bookmarkStart w:id="2897" w:name="kapitel_19"/>
       <w:pPr>
         <w:pStyle w:val="Heading1"/>
       </w:pPr>
       <w:r>
         <w:t>Der Anfang von etwas Größerem</w:t>
       </w:r>
-      <w:bookmarkEnd w:id="63457"/>
+      <w:bookmarkEnd w:id="2897"/>
     </w:p>
     <w:p>
       <w:pPr>
@@ -23623,6 +23623,60 @@
           <w:sz w:val="22"/>
         </w:rPr>
         <w:t>Einfach den Code scannen und eine Bewertung dalassen:</w:t>
+      </w:r>
+    </w:p>
+    <w:p>
+      <w:pPr>
+        <w:spacing w:line="240" w:lineRule="auto" w:before="120" w:after="120"/>
+        <w:jc w:val="center"/>
+      </w:pPr>
+      <w:r>
+        <w:drawing>
+          <wp:inline xmlns:a="http://schemas.openxmlformats.org/drawingml/2006/main" xmlns:pic="http://schemas.openxmlformats.org/drawingml/2006/picture">
+            <wp:extent cx="1371600" cy="1371600"/>
+            <wp:docPr id="1" name="Picture 1"/>
+            <wp:cNvGraphicFramePr>
+              <a:graphicFrameLocks noChangeAspect="1"/>
+            </wp:cNvGraphicFramePr>
+            <a:graphic>
+              <a:graphicData uri="http://schemas.openxmlformats.org/drawingml/2006/picture">
+                <pic:pic>
+                  <pic:nvPicPr>
+                    <pic:cNvPr id="0" name="qr_rezension_band3.png"/>
+                    <pic:cNvPicPr/>
+                  </pic:nvPicPr>
+                  <pic:blipFill>
+                    <a:blip r:embed="rId9"/>
+                    <a:stretch>
+                      <a:fillRect/>
+                    </a:stretch>
+                  </pic:blipFill>
+                  <pic:spPr>
+                    <a:xfrm>
+                      <a:off x="0" y="0"/>
+                      <a:ext cx="1371600" cy="1371600"/>
+                    </a:xfrm>
+                    <a:prstGeom prst="rect"/>
+                  </pic:spPr>
+                </pic:pic>
+              </a:graphicData>
+            </a:graphic>
+          </wp:inline>
+        </w:drawing>
+      </w:r>
+    </w:p>
+    <w:p>
+      <w:pPr>
+        <w:spacing w:after="200"/>
+        <w:jc w:val="center"/>
+      </w:pPr>
+      <w:r>
+        <w:rPr>
+          <w:rFonts w:ascii="Georgia" w:hAnsi="Georgia"/>
+          <w:i/>
+          <w:sz w:val="18"/>
+        </w:rPr>
+        <w:t>(Handykamera auf den Code halten – der Link öffnet sich von selbst.)</w:t>
       </w:r>
     </w:p>
     <w:p/>

</xml_diff>